<commit_message>
Remove section 5 from report
</commit_message>
<xml_diff>
--- a/Report.docx
+++ b/Report.docx
@@ -275,24 +275,6 @@
     <w:p>
       <w:r>
         <w:t>I solved this by establishing a clear responsibility chain: the Member class owns the borrow-limit check (since limits are member-tier-specific), while the Borrowable interface implementation owns the availability check and the actual state change (setting isAvailable to false and adding to the member's list). The Member.borrowItem() method first checks its own limit, then delegates to the Borrowable.borrow() method for the rest. This separation of concerns ensures each class validates only what it "knows about" and there is a single, predictable flow of control.</w:t>
-      </w:r>
-    </w:p>
-    <w:p>
-      <w:pPr>
-        <w:pStyle w:val="Heading1"/>
-      </w:pPr>
-      <w:r>
-        <w:t>5. What I Would Add Next</w:t>
-      </w:r>
-    </w:p>
-    <w:p>
-      <w:r>
-        <w:t>If I had more time, I would add a reservation/queue system for items that are currently borrowed. This feature would allow members to place a hold on an unavailable item and be notified (via the console report) when it becomes available.</w:t>
-      </w:r>
-    </w:p>
-    <w:p>
-      <w:r>
-        <w:t>Implementation design: I would create a new Reservable interface with methods reserve(Member) and cancelReservation(Member). The LibraryItem class would gain a Queue&lt;Member&gt; reservationQueue field. When an item is returned, the system checks if anyone is in the queue and automatically assigns it to the next member (or marks it as "on hold" so only that member can borrow it). A new ReservationFullException would be thrown if the queue exceeds a configurable limit. The Library class would get new menu options: "Reserve item" and "View my reservations." This design uses OOP principles: the interface defines the contract, the queue uses Java Collections, and the exception handling follows the existing pattern in the project.</w:t>
       </w:r>
     </w:p>
     <w:sectPr>

</xml_diff>